<commit_message>
docs: Add final project PDF reports and updated documentation
</commit_message>
<xml_diff>
--- a/Docs/EP (AutoRecovered).docx
+++ b/Docs/EP (AutoRecovered).docx
@@ -14845,7 +14845,7 @@
           <w:szCs w:val="24"/>
         </w:rPr>
         <w:drawing>
-          <wp:inline distT="0" distB="0" distL="0" distR="0" wp14:anchorId="4547D8DD" wp14:editId="71786FAC">
+          <wp:inline distT="0" distB="0" distL="0" distR="0" wp14:anchorId="4547D8DD" wp14:editId="451B1BAD">
             <wp:extent cx="5731510" cy="2908300"/>
             <wp:effectExtent l="0" t="0" r="2540" b="6350"/>
             <wp:docPr id="223531316" name="Picture 7"/>
@@ -14902,7 +14902,7 @@
         </w:rPr>
         <w:lastRenderedPageBreak/>
         <w:drawing>
-          <wp:inline distT="0" distB="0" distL="0" distR="0" wp14:anchorId="111ACE93" wp14:editId="1BA70506">
+          <wp:inline distT="0" distB="0" distL="0" distR="0" wp14:anchorId="111ACE93" wp14:editId="43704530">
             <wp:extent cx="5731510" cy="2926080"/>
             <wp:effectExtent l="0" t="0" r="2540" b="7620"/>
             <wp:docPr id="537126166" name="Picture 8"/>
@@ -15139,7 +15139,7 @@
           <w:szCs w:val="24"/>
         </w:rPr>
         <w:drawing>
-          <wp:inline distT="0" distB="0" distL="0" distR="0" wp14:anchorId="336B110F" wp14:editId="3515AD52">
+          <wp:inline distT="0" distB="0" distL="0" distR="0" wp14:anchorId="336B110F" wp14:editId="6B6CAE86">
             <wp:extent cx="5731510" cy="2762250"/>
             <wp:effectExtent l="0" t="0" r="2540" b="0"/>
             <wp:docPr id="518543674" name="Picture 9"/>
@@ -15196,7 +15196,7 @@
         </w:rPr>
         <w:lastRenderedPageBreak/>
         <w:drawing>
-          <wp:inline distT="0" distB="0" distL="0" distR="0" wp14:anchorId="27416B5C" wp14:editId="24539206">
+          <wp:inline distT="0" distB="0" distL="0" distR="0" wp14:anchorId="27416B5C" wp14:editId="2D6A8B3F">
             <wp:extent cx="5731510" cy="2937510"/>
             <wp:effectExtent l="0" t="0" r="2540" b="0"/>
             <wp:docPr id="1104930083" name="Picture 10"/>
@@ -21247,8 +21247,713 @@
         </w:rPr>
       </w:pPr>
     </w:p>
+    <w:p>
+      <w:pPr>
+        <w:pStyle w:val="Heading1"/>
+        <w:numPr>
+          <w:ilvl w:val="0"/>
+          <w:numId w:val="0"/>
+        </w:numPr>
+        <w:jc w:val="left"/>
+        <w:rPr>
+          <w:rStyle w:val="Strong"/>
+          <w:b/>
+          <w:bCs/>
+        </w:rPr>
+      </w:pPr>
+    </w:p>
+    <w:p>
+      <w:pPr>
+        <w:pStyle w:val="Heading1"/>
+        <w:numPr>
+          <w:ilvl w:val="0"/>
+          <w:numId w:val="0"/>
+        </w:numPr>
+        <w:rPr>
+          <w:rFonts w:ascii="Calibri body" w:hAnsi="Calibri body"/>
+          <w:sz w:val="32"/>
+          <w:szCs w:val="32"/>
+          <w:u w:val="single"/>
+        </w:rPr>
+      </w:pPr>
+      <w:r>
+        <w:rPr>
+          <w:rStyle w:val="Strong"/>
+          <w:rFonts w:asciiTheme="minorHAnsi" w:hAnsiTheme="minorHAnsi" w:cstheme="minorHAnsi"/>
+          <w:b/>
+          <w:bCs/>
+          <w:sz w:val="32"/>
+          <w:szCs w:val="32"/>
+          <w:u w:val="single"/>
+        </w:rPr>
+        <w:t>BIBLIOGRAPHY</w:t>
+      </w:r>
+    </w:p>
+    <w:p>
+      <w:pPr>
+        <w:pStyle w:val="ListParagraph"/>
+        <w:numPr>
+          <w:ilvl w:val="0"/>
+          <w:numId w:val="88"/>
+        </w:numPr>
+        <w:rPr>
+          <w:b/>
+          <w:bCs/>
+          <w:sz w:val="28"/>
+          <w:szCs w:val="28"/>
+        </w:rPr>
+      </w:pPr>
+      <w:r>
+        <w:rPr>
+          <w:b/>
+          <w:bCs/>
+          <w:sz w:val="28"/>
+          <w:szCs w:val="28"/>
+        </w:rPr>
+        <w:t>Designing Data-Intensive Applications</w:t>
+      </w:r>
+      <w:r>
+        <w:rPr>
+          <w:b/>
+          <w:bCs/>
+          <w:sz w:val="28"/>
+          <w:szCs w:val="28"/>
+        </w:rPr>
+        <w:br/>
+        <w:t xml:space="preserve">Martin Kleppmann, O’Reilly Media, 2017. </w:t>
+      </w:r>
+    </w:p>
+    <w:p>
+      <w:pPr>
+        <w:pStyle w:val="ListParagraph"/>
+        <w:numPr>
+          <w:ilvl w:val="0"/>
+          <w:numId w:val="88"/>
+        </w:numPr>
+        <w:rPr>
+          <w:b/>
+          <w:bCs/>
+          <w:sz w:val="28"/>
+          <w:szCs w:val="28"/>
+        </w:rPr>
+      </w:pPr>
+      <w:r>
+        <w:rPr>
+          <w:b/>
+          <w:bCs/>
+          <w:sz w:val="28"/>
+          <w:szCs w:val="28"/>
+        </w:rPr>
+        <w:t>Distributed Systems: Concepts and Design</w:t>
+      </w:r>
+      <w:r>
+        <w:rPr>
+          <w:b/>
+          <w:bCs/>
+          <w:sz w:val="28"/>
+          <w:szCs w:val="28"/>
+        </w:rPr>
+        <w:br/>
+        <w:t xml:space="preserve">George Coulouris, Jean Dollimore, Tim Kindberg, Gordon Blair, Pearson Education. </w:t>
+      </w:r>
+    </w:p>
+    <w:p>
+      <w:pPr>
+        <w:pStyle w:val="ListParagraph"/>
+        <w:numPr>
+          <w:ilvl w:val="0"/>
+          <w:numId w:val="88"/>
+        </w:numPr>
+        <w:rPr>
+          <w:b/>
+          <w:bCs/>
+          <w:sz w:val="28"/>
+          <w:szCs w:val="28"/>
+        </w:rPr>
+      </w:pPr>
+      <w:r>
+        <w:rPr>
+          <w:b/>
+          <w:bCs/>
+          <w:sz w:val="28"/>
+          <w:szCs w:val="28"/>
+        </w:rPr>
+        <w:t>Apache Kafka Official Documentation</w:t>
+      </w:r>
+      <w:r>
+        <w:rPr>
+          <w:b/>
+          <w:bCs/>
+          <w:sz w:val="28"/>
+          <w:szCs w:val="28"/>
+        </w:rPr>
+        <w:br/>
+        <w:t xml:space="preserve">Available at: </w:t>
+      </w:r>
+      <w:hyperlink r:id="rId29" w:tgtFrame="_new" w:history="1">
+        <w:r>
+          <w:rPr>
+            <w:rStyle w:val="Hyperlink"/>
+            <w:b/>
+            <w:bCs/>
+            <w:sz w:val="28"/>
+            <w:szCs w:val="28"/>
+          </w:rPr>
+          <w:t>https://kafka.apache.org/documentation/</w:t>
+        </w:r>
+      </w:hyperlink>
+      <w:r>
+        <w:rPr>
+          <w:b/>
+          <w:bCs/>
+          <w:sz w:val="28"/>
+          <w:szCs w:val="28"/>
+        </w:rPr>
+        <w:t xml:space="preserve"> </w:t>
+      </w:r>
+    </w:p>
+    <w:p>
+      <w:pPr>
+        <w:pStyle w:val="ListParagraph"/>
+        <w:numPr>
+          <w:ilvl w:val="0"/>
+          <w:numId w:val="88"/>
+        </w:numPr>
+        <w:rPr>
+          <w:b/>
+          <w:bCs/>
+          <w:sz w:val="28"/>
+          <w:szCs w:val="28"/>
+        </w:rPr>
+      </w:pPr>
+      <w:r>
+        <w:rPr>
+          <w:b/>
+          <w:bCs/>
+          <w:sz w:val="28"/>
+          <w:szCs w:val="28"/>
+        </w:rPr>
+        <w:t xml:space="preserve">Apache </w:t>
+      </w:r>
+      <w:r>
+        <w:rPr>
+          <w:b/>
+          <w:bCs/>
+          <w:sz w:val="28"/>
+          <w:szCs w:val="28"/>
+        </w:rPr>
+        <w:t>Zookeeper</w:t>
+      </w:r>
+      <w:r>
+        <w:rPr>
+          <w:b/>
+          <w:bCs/>
+          <w:sz w:val="28"/>
+          <w:szCs w:val="28"/>
+        </w:rPr>
+        <w:t xml:space="preserve"> Official Documentation</w:t>
+      </w:r>
+      <w:r>
+        <w:rPr>
+          <w:b/>
+          <w:bCs/>
+          <w:sz w:val="28"/>
+          <w:szCs w:val="28"/>
+        </w:rPr>
+        <w:br/>
+        <w:t xml:space="preserve">Available at: </w:t>
+      </w:r>
+      <w:hyperlink r:id="rId30" w:tgtFrame="_new" w:history="1">
+        <w:r>
+          <w:rPr>
+            <w:rStyle w:val="Hyperlink"/>
+            <w:b/>
+            <w:bCs/>
+            <w:sz w:val="28"/>
+            <w:szCs w:val="28"/>
+          </w:rPr>
+          <w:t>https://zookeeper.apache.org/doc/</w:t>
+        </w:r>
+      </w:hyperlink>
+      <w:r>
+        <w:rPr>
+          <w:b/>
+          <w:bCs/>
+          <w:sz w:val="28"/>
+          <w:szCs w:val="28"/>
+        </w:rPr>
+        <w:t xml:space="preserve"> </w:t>
+      </w:r>
+    </w:p>
+    <w:p>
+      <w:pPr>
+        <w:pStyle w:val="ListParagraph"/>
+        <w:numPr>
+          <w:ilvl w:val="0"/>
+          <w:numId w:val="88"/>
+        </w:numPr>
+        <w:rPr>
+          <w:b/>
+          <w:bCs/>
+          <w:sz w:val="28"/>
+          <w:szCs w:val="28"/>
+        </w:rPr>
+      </w:pPr>
+      <w:r>
+        <w:rPr>
+          <w:b/>
+          <w:bCs/>
+          <w:sz w:val="28"/>
+          <w:szCs w:val="28"/>
+        </w:rPr>
+        <w:t>Java Platform, Standard Edition 11</w:t>
+      </w:r>
+      <w:r>
+        <w:rPr>
+          <w:b/>
+          <w:bCs/>
+          <w:sz w:val="28"/>
+          <w:szCs w:val="28"/>
+        </w:rPr>
+        <w:br/>
+        <w:t>Oracle Corporation</w:t>
+      </w:r>
+      <w:r>
+        <w:rPr>
+          <w:b/>
+          <w:bCs/>
+          <w:sz w:val="28"/>
+          <w:szCs w:val="28"/>
+        </w:rPr>
+        <w:br/>
+        <w:t xml:space="preserve">Available at: </w:t>
+      </w:r>
+      <w:hyperlink r:id="rId31" w:tgtFrame="_new" w:history="1">
+        <w:r>
+          <w:rPr>
+            <w:rStyle w:val="Hyperlink"/>
+            <w:b/>
+            <w:bCs/>
+            <w:sz w:val="28"/>
+            <w:szCs w:val="28"/>
+          </w:rPr>
+          <w:t>https://docs.oracle.com/en/java/javase/11/</w:t>
+        </w:r>
+      </w:hyperlink>
+      <w:r>
+        <w:rPr>
+          <w:b/>
+          <w:bCs/>
+          <w:sz w:val="28"/>
+          <w:szCs w:val="28"/>
+        </w:rPr>
+        <w:t xml:space="preserve"> </w:t>
+      </w:r>
+    </w:p>
+    <w:p>
+      <w:pPr>
+        <w:pStyle w:val="ListParagraph"/>
+        <w:numPr>
+          <w:ilvl w:val="0"/>
+          <w:numId w:val="88"/>
+        </w:numPr>
+        <w:rPr>
+          <w:b/>
+          <w:bCs/>
+          <w:sz w:val="28"/>
+          <w:szCs w:val="28"/>
+        </w:rPr>
+      </w:pPr>
+      <w:proofErr w:type="spellStart"/>
+      <w:r>
+        <w:rPr>
+          <w:b/>
+          <w:bCs/>
+          <w:sz w:val="28"/>
+          <w:szCs w:val="28"/>
+        </w:rPr>
+        <w:t>Javalin</w:t>
+      </w:r>
+      <w:proofErr w:type="spellEnd"/>
+      <w:r>
+        <w:rPr>
+          <w:b/>
+          <w:bCs/>
+          <w:sz w:val="28"/>
+          <w:szCs w:val="28"/>
+        </w:rPr>
+        <w:t xml:space="preserve"> Documentation</w:t>
+      </w:r>
+      <w:r>
+        <w:rPr>
+          <w:b/>
+          <w:bCs/>
+          <w:sz w:val="28"/>
+          <w:szCs w:val="28"/>
+        </w:rPr>
+        <w:br/>
+        <w:t xml:space="preserve">Available at: </w:t>
+      </w:r>
+      <w:hyperlink r:id="rId32" w:tgtFrame="_new" w:history="1">
+        <w:r>
+          <w:rPr>
+            <w:rStyle w:val="Hyperlink"/>
+            <w:b/>
+            <w:bCs/>
+            <w:sz w:val="28"/>
+            <w:szCs w:val="28"/>
+          </w:rPr>
+          <w:t>https://javalin.io/documentation</w:t>
+        </w:r>
+      </w:hyperlink>
+      <w:r>
+        <w:rPr>
+          <w:b/>
+          <w:bCs/>
+          <w:sz w:val="28"/>
+          <w:szCs w:val="28"/>
+        </w:rPr>
+        <w:t xml:space="preserve"> </w:t>
+      </w:r>
+    </w:p>
+    <w:p>
+      <w:pPr>
+        <w:pStyle w:val="ListParagraph"/>
+        <w:numPr>
+          <w:ilvl w:val="0"/>
+          <w:numId w:val="88"/>
+        </w:numPr>
+        <w:rPr>
+          <w:b/>
+          <w:bCs/>
+          <w:sz w:val="28"/>
+          <w:szCs w:val="28"/>
+        </w:rPr>
+      </w:pPr>
+      <w:r>
+        <w:rPr>
+          <w:b/>
+          <w:bCs/>
+          <w:sz w:val="28"/>
+          <w:szCs w:val="28"/>
+        </w:rPr>
+        <w:t>Tailwind CSS Documentation</w:t>
+      </w:r>
+      <w:r>
+        <w:rPr>
+          <w:b/>
+          <w:bCs/>
+          <w:sz w:val="28"/>
+          <w:szCs w:val="28"/>
+        </w:rPr>
+        <w:br/>
+        <w:t xml:space="preserve">Available at: </w:t>
+      </w:r>
+      <w:hyperlink r:id="rId33" w:tgtFrame="_new" w:history="1">
+        <w:r>
+          <w:rPr>
+            <w:rStyle w:val="Hyperlink"/>
+            <w:b/>
+            <w:bCs/>
+            <w:sz w:val="28"/>
+            <w:szCs w:val="28"/>
+          </w:rPr>
+          <w:t>https://tailwindcss.com/docs</w:t>
+        </w:r>
+      </w:hyperlink>
+      <w:r>
+        <w:rPr>
+          <w:b/>
+          <w:bCs/>
+          <w:sz w:val="28"/>
+          <w:szCs w:val="28"/>
+        </w:rPr>
+        <w:t xml:space="preserve"> </w:t>
+      </w:r>
+    </w:p>
+    <w:p>
+      <w:pPr>
+        <w:pStyle w:val="ListParagraph"/>
+        <w:numPr>
+          <w:ilvl w:val="0"/>
+          <w:numId w:val="88"/>
+        </w:numPr>
+        <w:rPr>
+          <w:b/>
+          <w:bCs/>
+          <w:sz w:val="28"/>
+          <w:szCs w:val="28"/>
+        </w:rPr>
+      </w:pPr>
+      <w:r>
+        <w:rPr>
+          <w:b/>
+          <w:bCs/>
+          <w:sz w:val="28"/>
+          <w:szCs w:val="28"/>
+        </w:rPr>
+        <w:t>Vite Documentation</w:t>
+      </w:r>
+      <w:r>
+        <w:rPr>
+          <w:b/>
+          <w:bCs/>
+          <w:sz w:val="28"/>
+          <w:szCs w:val="28"/>
+        </w:rPr>
+        <w:br/>
+        <w:t xml:space="preserve">Available at: </w:t>
+      </w:r>
+      <w:hyperlink r:id="rId34" w:tgtFrame="_new" w:history="1">
+        <w:r>
+          <w:rPr>
+            <w:rStyle w:val="Hyperlink"/>
+            <w:b/>
+            <w:bCs/>
+            <w:sz w:val="28"/>
+            <w:szCs w:val="28"/>
+          </w:rPr>
+          <w:t>https://vitejs.dev/guide/</w:t>
+        </w:r>
+      </w:hyperlink>
+      <w:r>
+        <w:rPr>
+          <w:b/>
+          <w:bCs/>
+          <w:sz w:val="28"/>
+          <w:szCs w:val="28"/>
+        </w:rPr>
+        <w:t xml:space="preserve"> </w:t>
+      </w:r>
+    </w:p>
+    <w:p>
+      <w:pPr>
+        <w:pStyle w:val="ListParagraph"/>
+        <w:numPr>
+          <w:ilvl w:val="0"/>
+          <w:numId w:val="88"/>
+        </w:numPr>
+        <w:rPr>
+          <w:b/>
+          <w:bCs/>
+          <w:sz w:val="28"/>
+          <w:szCs w:val="28"/>
+        </w:rPr>
+      </w:pPr>
+      <w:r>
+        <w:rPr>
+          <w:b/>
+          <w:bCs/>
+          <w:sz w:val="28"/>
+          <w:szCs w:val="28"/>
+        </w:rPr>
+        <w:t>Mozilla Developer Network</w:t>
+      </w:r>
+      <w:r>
+        <w:rPr>
+          <w:b/>
+          <w:bCs/>
+          <w:sz w:val="28"/>
+          <w:szCs w:val="28"/>
+        </w:rPr>
+        <w:br/>
+        <w:t>Fetch API Documentation</w:t>
+      </w:r>
+      <w:r>
+        <w:rPr>
+          <w:b/>
+          <w:bCs/>
+          <w:sz w:val="28"/>
+          <w:szCs w:val="28"/>
+        </w:rPr>
+        <w:br/>
+        <w:t xml:space="preserve">Available at: </w:t>
+      </w:r>
+      <w:hyperlink r:id="rId35" w:tgtFrame="_new" w:history="1">
+        <w:r>
+          <w:rPr>
+            <w:rStyle w:val="Hyperlink"/>
+            <w:b/>
+            <w:bCs/>
+            <w:sz w:val="28"/>
+            <w:szCs w:val="28"/>
+          </w:rPr>
+          <w:t>https://developer.mozilla.org/en-US/docs/Web/API/Fetch_API</w:t>
+        </w:r>
+      </w:hyperlink>
+      <w:r>
+        <w:rPr>
+          <w:b/>
+          <w:bCs/>
+          <w:sz w:val="28"/>
+          <w:szCs w:val="28"/>
+        </w:rPr>
+        <w:t xml:space="preserve"> </w:t>
+      </w:r>
+    </w:p>
+    <w:p>
+      <w:pPr>
+        <w:pStyle w:val="ListParagraph"/>
+        <w:numPr>
+          <w:ilvl w:val="0"/>
+          <w:numId w:val="88"/>
+        </w:numPr>
+        <w:rPr>
+          <w:b/>
+          <w:bCs/>
+          <w:sz w:val="28"/>
+          <w:szCs w:val="28"/>
+        </w:rPr>
+      </w:pPr>
+      <w:r>
+        <w:rPr>
+          <w:b/>
+          <w:bCs/>
+          <w:sz w:val="28"/>
+          <w:szCs w:val="28"/>
+        </w:rPr>
+        <w:t xml:space="preserve">Research Paper: </w:t>
+      </w:r>
+      <w:r>
+        <w:rPr>
+          <w:b/>
+          <w:bCs/>
+          <w:i/>
+          <w:iCs/>
+          <w:sz w:val="28"/>
+          <w:szCs w:val="28"/>
+        </w:rPr>
+        <w:t>Kafka: A Distributed Messaging System for Log Processing</w:t>
+      </w:r>
+      <w:r>
+        <w:rPr>
+          <w:b/>
+          <w:bCs/>
+          <w:sz w:val="28"/>
+          <w:szCs w:val="28"/>
+        </w:rPr>
+        <w:br/>
+        <w:t xml:space="preserve">Available at: </w:t>
+      </w:r>
+      <w:hyperlink r:id="rId36" w:tgtFrame="_new" w:history="1">
+        <w:r>
+          <w:rPr>
+            <w:rStyle w:val="Hyperlink"/>
+            <w:b/>
+            <w:bCs/>
+            <w:sz w:val="28"/>
+            <w:szCs w:val="28"/>
+          </w:rPr>
+          <w:t>https://www.microsoft.com/en-us/research/publication/kafka-a-distributed-messaging-system-for-log-processing/</w:t>
+        </w:r>
+      </w:hyperlink>
+      <w:r>
+        <w:rPr>
+          <w:b/>
+          <w:bCs/>
+          <w:sz w:val="28"/>
+          <w:szCs w:val="28"/>
+        </w:rPr>
+        <w:t xml:space="preserve"> </w:t>
+      </w:r>
+    </w:p>
+    <w:p>
+      <w:pPr>
+        <w:pStyle w:val="ListParagraph"/>
+        <w:numPr>
+          <w:ilvl w:val="0"/>
+          <w:numId w:val="88"/>
+        </w:numPr>
+        <w:rPr>
+          <w:b/>
+          <w:bCs/>
+          <w:sz w:val="28"/>
+          <w:szCs w:val="28"/>
+        </w:rPr>
+      </w:pPr>
+      <w:r>
+        <w:rPr>
+          <w:b/>
+          <w:bCs/>
+          <w:sz w:val="28"/>
+          <w:szCs w:val="28"/>
+        </w:rPr>
+        <w:t>Confluent Inc., “Kafka Architecture and Design Concepts”</w:t>
+      </w:r>
+      <w:r>
+        <w:rPr>
+          <w:b/>
+          <w:bCs/>
+          <w:sz w:val="28"/>
+          <w:szCs w:val="28"/>
+        </w:rPr>
+        <w:br/>
+        <w:t xml:space="preserve">Available at: </w:t>
+      </w:r>
+      <w:hyperlink r:id="rId37" w:tgtFrame="_new" w:history="1">
+        <w:r>
+          <w:rPr>
+            <w:rStyle w:val="Hyperlink"/>
+            <w:b/>
+            <w:bCs/>
+            <w:sz w:val="28"/>
+            <w:szCs w:val="28"/>
+          </w:rPr>
+          <w:t>https://www.confluent.io/blog/</w:t>
+        </w:r>
+      </w:hyperlink>
+      <w:r>
+        <w:rPr>
+          <w:b/>
+          <w:bCs/>
+          <w:sz w:val="28"/>
+          <w:szCs w:val="28"/>
+        </w:rPr>
+        <w:t xml:space="preserve"> </w:t>
+      </w:r>
+    </w:p>
+    <w:p>
+      <w:pPr>
+        <w:pStyle w:val="ListParagraph"/>
+        <w:numPr>
+          <w:ilvl w:val="0"/>
+          <w:numId w:val="88"/>
+        </w:numPr>
+        <w:rPr>
+          <w:b/>
+          <w:bCs/>
+          <w:sz w:val="28"/>
+          <w:szCs w:val="28"/>
+        </w:rPr>
+      </w:pPr>
+      <w:r>
+        <w:rPr>
+          <w:b/>
+          <w:bCs/>
+          <w:sz w:val="28"/>
+          <w:szCs w:val="28"/>
+        </w:rPr>
+        <w:t>Various online tutorials and technical blogs on distributed systems, event streaming, and real-time messaging architectures.</w:t>
+      </w:r>
+    </w:p>
+    <w:p>
+      <w:pPr>
+        <w:rPr>
+          <w:sz w:val="24"/>
+          <w:szCs w:val="24"/>
+        </w:rPr>
+      </w:pPr>
+    </w:p>
+    <w:p>
+      <w:pPr>
+        <w:rPr>
+          <w:sz w:val="24"/>
+          <w:szCs w:val="24"/>
+        </w:rPr>
+      </w:pPr>
+    </w:p>
     <w:sectPr>
-      <w:footerReference w:type="default" r:id="rId29"/>
+      <w:footerReference w:type="default" r:id="rId38"/>
       <w:pgSz w:w="11906" w:h="16838"/>
       <w:pgMar w:top="1440" w:right="1440" w:bottom="1440" w:left="1440" w:header="708" w:footer="708" w:gutter="0"/>
       <w:cols w:space="708"/>
@@ -27114,6 +27819,119 @@
     </w:lvl>
   </w:abstractNum>
   <w:abstractNum w:abstractNumId="51" w15:restartNumberingAfterBreak="0">
+    <w:nsid w:val="4AE90B51"/>
+    <w:multiLevelType w:val="multilevel"/>
+    <w:tmpl w:val="AC0A7756"/>
+    <w:lvl w:ilvl="0">
+      <w:start w:val="1"/>
+      <w:numFmt w:val="decimal"/>
+      <w:lvlText w:val="%1."/>
+      <w:lvlJc w:val="left"/>
+      <w:pPr>
+        <w:tabs>
+          <w:tab w:val="num" w:pos="720"/>
+        </w:tabs>
+        <w:ind w:left="720" w:hanging="360"/>
+      </w:pPr>
+    </w:lvl>
+    <w:lvl w:ilvl="1" w:tentative="1">
+      <w:start w:val="1"/>
+      <w:numFmt w:val="decimal"/>
+      <w:lvlText w:val="%2."/>
+      <w:lvlJc w:val="left"/>
+      <w:pPr>
+        <w:tabs>
+          <w:tab w:val="num" w:pos="1440"/>
+        </w:tabs>
+        <w:ind w:left="1440" w:hanging="360"/>
+      </w:pPr>
+    </w:lvl>
+    <w:lvl w:ilvl="2" w:tentative="1">
+      <w:start w:val="1"/>
+      <w:numFmt w:val="decimal"/>
+      <w:lvlText w:val="%3."/>
+      <w:lvlJc w:val="left"/>
+      <w:pPr>
+        <w:tabs>
+          <w:tab w:val="num" w:pos="2160"/>
+        </w:tabs>
+        <w:ind w:left="2160" w:hanging="360"/>
+      </w:pPr>
+    </w:lvl>
+    <w:lvl w:ilvl="3" w:tentative="1">
+      <w:start w:val="1"/>
+      <w:numFmt w:val="decimal"/>
+      <w:lvlText w:val="%4."/>
+      <w:lvlJc w:val="left"/>
+      <w:pPr>
+        <w:tabs>
+          <w:tab w:val="num" w:pos="2880"/>
+        </w:tabs>
+        <w:ind w:left="2880" w:hanging="360"/>
+      </w:pPr>
+    </w:lvl>
+    <w:lvl w:ilvl="4" w:tentative="1">
+      <w:start w:val="1"/>
+      <w:numFmt w:val="decimal"/>
+      <w:lvlText w:val="%5."/>
+      <w:lvlJc w:val="left"/>
+      <w:pPr>
+        <w:tabs>
+          <w:tab w:val="num" w:pos="3600"/>
+        </w:tabs>
+        <w:ind w:left="3600" w:hanging="360"/>
+      </w:pPr>
+    </w:lvl>
+    <w:lvl w:ilvl="5" w:tentative="1">
+      <w:start w:val="1"/>
+      <w:numFmt w:val="decimal"/>
+      <w:lvlText w:val="%6."/>
+      <w:lvlJc w:val="left"/>
+      <w:pPr>
+        <w:tabs>
+          <w:tab w:val="num" w:pos="4320"/>
+        </w:tabs>
+        <w:ind w:left="4320" w:hanging="360"/>
+      </w:pPr>
+    </w:lvl>
+    <w:lvl w:ilvl="6" w:tentative="1">
+      <w:start w:val="1"/>
+      <w:numFmt w:val="decimal"/>
+      <w:lvlText w:val="%7."/>
+      <w:lvlJc w:val="left"/>
+      <w:pPr>
+        <w:tabs>
+          <w:tab w:val="num" w:pos="5040"/>
+        </w:tabs>
+        <w:ind w:left="5040" w:hanging="360"/>
+      </w:pPr>
+    </w:lvl>
+    <w:lvl w:ilvl="7" w:tentative="1">
+      <w:start w:val="1"/>
+      <w:numFmt w:val="decimal"/>
+      <w:lvlText w:val="%8."/>
+      <w:lvlJc w:val="left"/>
+      <w:pPr>
+        <w:tabs>
+          <w:tab w:val="num" w:pos="5760"/>
+        </w:tabs>
+        <w:ind w:left="5760" w:hanging="360"/>
+      </w:pPr>
+    </w:lvl>
+    <w:lvl w:ilvl="8" w:tentative="1">
+      <w:start w:val="1"/>
+      <w:numFmt w:val="decimal"/>
+      <w:lvlText w:val="%9."/>
+      <w:lvlJc w:val="left"/>
+      <w:pPr>
+        <w:tabs>
+          <w:tab w:val="num" w:pos="6480"/>
+        </w:tabs>
+        <w:ind w:left="6480" w:hanging="360"/>
+      </w:pPr>
+    </w:lvl>
+  </w:abstractNum>
+  <w:abstractNum w:abstractNumId="52" w15:restartNumberingAfterBreak="0">
     <w:nsid w:val="4BD02ED2"/>
     <w:multiLevelType w:val="multilevel"/>
     <w:tmpl w:val="C71AA2B0"/>
@@ -27226,7 +28044,7 @@
       </w:pPr>
     </w:lvl>
   </w:abstractNum>
-  <w:abstractNum w:abstractNumId="52" w15:restartNumberingAfterBreak="0">
+  <w:abstractNum w:abstractNumId="53" w15:restartNumberingAfterBreak="0">
     <w:nsid w:val="4C3557F0"/>
     <w:multiLevelType w:val="hybridMultilevel"/>
     <w:tmpl w:val="CF3E22CE"/>
@@ -27339,7 +28157,7 @@
       </w:rPr>
     </w:lvl>
   </w:abstractNum>
-  <w:abstractNum w:abstractNumId="53" w15:restartNumberingAfterBreak="0">
+  <w:abstractNum w:abstractNumId="54" w15:restartNumberingAfterBreak="0">
     <w:nsid w:val="51BE1E64"/>
     <w:multiLevelType w:val="hybridMultilevel"/>
     <w:tmpl w:val="4608F980"/>
@@ -27451,7 +28269,7 @@
       </w:rPr>
     </w:lvl>
   </w:abstractNum>
-  <w:abstractNum w:abstractNumId="54" w15:restartNumberingAfterBreak="0">
+  <w:abstractNum w:abstractNumId="55" w15:restartNumberingAfterBreak="0">
     <w:nsid w:val="53E00740"/>
     <w:multiLevelType w:val="hybridMultilevel"/>
     <w:tmpl w:val="8D02EF22"/>
@@ -27563,7 +28381,7 @@
       </w:rPr>
     </w:lvl>
   </w:abstractNum>
-  <w:abstractNum w:abstractNumId="55" w15:restartNumberingAfterBreak="0">
+  <w:abstractNum w:abstractNumId="56" w15:restartNumberingAfterBreak="0">
     <w:nsid w:val="55FB42D1"/>
     <w:multiLevelType w:val="hybridMultilevel"/>
     <w:tmpl w:val="33E688FE"/>
@@ -27676,7 +28494,7 @@
       </w:rPr>
     </w:lvl>
   </w:abstractNum>
-  <w:abstractNum w:abstractNumId="56" w15:restartNumberingAfterBreak="0">
+  <w:abstractNum w:abstractNumId="57" w15:restartNumberingAfterBreak="0">
     <w:nsid w:val="56A71D81"/>
     <w:multiLevelType w:val="hybridMultilevel"/>
     <w:tmpl w:val="0BB8D83E"/>
@@ -27789,7 +28607,7 @@
       </w:rPr>
     </w:lvl>
   </w:abstractNum>
-  <w:abstractNum w:abstractNumId="57" w15:restartNumberingAfterBreak="0">
+  <w:abstractNum w:abstractNumId="58" w15:restartNumberingAfterBreak="0">
     <w:nsid w:val="5D4E4565"/>
     <w:multiLevelType w:val="hybridMultilevel"/>
     <w:tmpl w:val="E030295A"/>
@@ -27901,7 +28719,7 @@
       </w:rPr>
     </w:lvl>
   </w:abstractNum>
-  <w:abstractNum w:abstractNumId="58" w15:restartNumberingAfterBreak="0">
+  <w:abstractNum w:abstractNumId="59" w15:restartNumberingAfterBreak="0">
     <w:nsid w:val="5E8A0CF7"/>
     <w:multiLevelType w:val="hybridMultilevel"/>
     <w:tmpl w:val="42426C3C"/>
@@ -28014,7 +28832,7 @@
       </w:rPr>
     </w:lvl>
   </w:abstractNum>
-  <w:abstractNum w:abstractNumId="59" w15:restartNumberingAfterBreak="0">
+  <w:abstractNum w:abstractNumId="60" w15:restartNumberingAfterBreak="0">
     <w:nsid w:val="5EC16A11"/>
     <w:multiLevelType w:val="hybridMultilevel"/>
     <w:tmpl w:val="EEC24ED2"/>
@@ -28126,7 +28944,7 @@
       </w:rPr>
     </w:lvl>
   </w:abstractNum>
-  <w:abstractNum w:abstractNumId="60" w15:restartNumberingAfterBreak="0">
+  <w:abstractNum w:abstractNumId="61" w15:restartNumberingAfterBreak="0">
     <w:nsid w:val="60125921"/>
     <w:multiLevelType w:val="hybridMultilevel"/>
     <w:tmpl w:val="2954F59A"/>
@@ -28239,7 +29057,7 @@
       </w:rPr>
     </w:lvl>
   </w:abstractNum>
-  <w:abstractNum w:abstractNumId="61" w15:restartNumberingAfterBreak="0">
+  <w:abstractNum w:abstractNumId="62" w15:restartNumberingAfterBreak="0">
     <w:nsid w:val="60932CB4"/>
     <w:multiLevelType w:val="hybridMultilevel"/>
     <w:tmpl w:val="45BCB9DA"/>
@@ -28351,7 +29169,7 @@
       </w:rPr>
     </w:lvl>
   </w:abstractNum>
-  <w:abstractNum w:abstractNumId="62" w15:restartNumberingAfterBreak="0">
+  <w:abstractNum w:abstractNumId="63" w15:restartNumberingAfterBreak="0">
     <w:nsid w:val="60A32B82"/>
     <w:multiLevelType w:val="multilevel"/>
     <w:tmpl w:val="A94C5850"/>
@@ -28464,7 +29282,93 @@
       </w:pPr>
     </w:lvl>
   </w:abstractNum>
-  <w:abstractNum w:abstractNumId="63" w15:restartNumberingAfterBreak="0">
+  <w:abstractNum w:abstractNumId="64" w15:restartNumberingAfterBreak="0">
+    <w:nsid w:val="60F4450C"/>
+    <w:multiLevelType w:val="hybridMultilevel"/>
+    <w:tmpl w:val="929A89DC"/>
+    <w:lvl w:ilvl="0" w:tplc="FFFFFFFF">
+      <w:start w:val="1"/>
+      <w:numFmt w:val="decimal"/>
+      <w:lvlText w:val="%1."/>
+      <w:lvlJc w:val="left"/>
+      <w:pPr>
+        <w:ind w:left="720" w:hanging="360"/>
+      </w:pPr>
+    </w:lvl>
+    <w:lvl w:ilvl="1" w:tplc="FFFFFFFF" w:tentative="1">
+      <w:start w:val="1"/>
+      <w:numFmt w:val="lowerLetter"/>
+      <w:lvlText w:val="%2."/>
+      <w:lvlJc w:val="left"/>
+      <w:pPr>
+        <w:ind w:left="1440" w:hanging="360"/>
+      </w:pPr>
+    </w:lvl>
+    <w:lvl w:ilvl="2" w:tplc="FFFFFFFF" w:tentative="1">
+      <w:start w:val="1"/>
+      <w:numFmt w:val="lowerRoman"/>
+      <w:lvlText w:val="%3."/>
+      <w:lvlJc w:val="right"/>
+      <w:pPr>
+        <w:ind w:left="2160" w:hanging="180"/>
+      </w:pPr>
+    </w:lvl>
+    <w:lvl w:ilvl="3" w:tplc="FFFFFFFF" w:tentative="1">
+      <w:start w:val="1"/>
+      <w:numFmt w:val="decimal"/>
+      <w:lvlText w:val="%4."/>
+      <w:lvlJc w:val="left"/>
+      <w:pPr>
+        <w:ind w:left="2880" w:hanging="360"/>
+      </w:pPr>
+    </w:lvl>
+    <w:lvl w:ilvl="4" w:tplc="FFFFFFFF" w:tentative="1">
+      <w:start w:val="1"/>
+      <w:numFmt w:val="lowerLetter"/>
+      <w:lvlText w:val="%5."/>
+      <w:lvlJc w:val="left"/>
+      <w:pPr>
+        <w:ind w:left="3600" w:hanging="360"/>
+      </w:pPr>
+    </w:lvl>
+    <w:lvl w:ilvl="5" w:tplc="FFFFFFFF" w:tentative="1">
+      <w:start w:val="1"/>
+      <w:numFmt w:val="lowerRoman"/>
+      <w:lvlText w:val="%6."/>
+      <w:lvlJc w:val="right"/>
+      <w:pPr>
+        <w:ind w:left="4320" w:hanging="180"/>
+      </w:pPr>
+    </w:lvl>
+    <w:lvl w:ilvl="6" w:tplc="FFFFFFFF" w:tentative="1">
+      <w:start w:val="1"/>
+      <w:numFmt w:val="decimal"/>
+      <w:lvlText w:val="%7."/>
+      <w:lvlJc w:val="left"/>
+      <w:pPr>
+        <w:ind w:left="5040" w:hanging="360"/>
+      </w:pPr>
+    </w:lvl>
+    <w:lvl w:ilvl="7" w:tplc="FFFFFFFF" w:tentative="1">
+      <w:start w:val="1"/>
+      <w:numFmt w:val="lowerLetter"/>
+      <w:lvlText w:val="%8."/>
+      <w:lvlJc w:val="left"/>
+      <w:pPr>
+        <w:ind w:left="5760" w:hanging="360"/>
+      </w:pPr>
+    </w:lvl>
+    <w:lvl w:ilvl="8" w:tplc="FFFFFFFF" w:tentative="1">
+      <w:start w:val="1"/>
+      <w:numFmt w:val="lowerRoman"/>
+      <w:lvlText w:val="%9."/>
+      <w:lvlJc w:val="right"/>
+      <w:pPr>
+        <w:ind w:left="6480" w:hanging="180"/>
+      </w:pPr>
+    </w:lvl>
+  </w:abstractNum>
+  <w:abstractNum w:abstractNumId="65" w15:restartNumberingAfterBreak="0">
     <w:nsid w:val="637551F2"/>
     <w:multiLevelType w:val="hybridMultilevel"/>
     <w:tmpl w:val="DACA2030"/>
@@ -28576,7 +29480,7 @@
       </w:rPr>
     </w:lvl>
   </w:abstractNum>
-  <w:abstractNum w:abstractNumId="64" w15:restartNumberingAfterBreak="0">
+  <w:abstractNum w:abstractNumId="66" w15:restartNumberingAfterBreak="0">
     <w:nsid w:val="64DA4159"/>
     <w:multiLevelType w:val="hybridMultilevel"/>
     <w:tmpl w:val="628AAABC"/>
@@ -28688,7 +29592,7 @@
       </w:rPr>
     </w:lvl>
   </w:abstractNum>
-  <w:abstractNum w:abstractNumId="65" w15:restartNumberingAfterBreak="0">
+  <w:abstractNum w:abstractNumId="67" w15:restartNumberingAfterBreak="0">
     <w:nsid w:val="69AF3F7F"/>
     <w:multiLevelType w:val="hybridMultilevel"/>
     <w:tmpl w:val="4F90DEAE"/>
@@ -28800,7 +29704,7 @@
       </w:rPr>
     </w:lvl>
   </w:abstractNum>
-  <w:abstractNum w:abstractNumId="66" w15:restartNumberingAfterBreak="0">
+  <w:abstractNum w:abstractNumId="68" w15:restartNumberingAfterBreak="0">
     <w:nsid w:val="6A686BDA"/>
     <w:multiLevelType w:val="hybridMultilevel"/>
     <w:tmpl w:val="D01C6204"/>
@@ -28913,7 +29817,7 @@
       </w:rPr>
     </w:lvl>
   </w:abstractNum>
-  <w:abstractNum w:abstractNumId="67" w15:restartNumberingAfterBreak="0">
+  <w:abstractNum w:abstractNumId="69" w15:restartNumberingAfterBreak="0">
     <w:nsid w:val="6BD47300"/>
     <w:multiLevelType w:val="hybridMultilevel"/>
     <w:tmpl w:val="4830DC2A"/>
@@ -29026,7 +29930,7 @@
       </w:rPr>
     </w:lvl>
   </w:abstractNum>
-  <w:abstractNum w:abstractNumId="68" w15:restartNumberingAfterBreak="0">
+  <w:abstractNum w:abstractNumId="70" w15:restartNumberingAfterBreak="0">
     <w:nsid w:val="6BD52142"/>
     <w:multiLevelType w:val="multilevel"/>
     <w:tmpl w:val="32A8C2E0"/>
@@ -29139,7 +30043,7 @@
       </w:rPr>
     </w:lvl>
   </w:abstractNum>
-  <w:abstractNum w:abstractNumId="69" w15:restartNumberingAfterBreak="0">
+  <w:abstractNum w:abstractNumId="71" w15:restartNumberingAfterBreak="0">
     <w:nsid w:val="6BF32643"/>
     <w:multiLevelType w:val="hybridMultilevel"/>
     <w:tmpl w:val="418E5D7E"/>
@@ -29252,7 +30156,7 @@
       </w:rPr>
     </w:lvl>
   </w:abstractNum>
-  <w:abstractNum w:abstractNumId="70" w15:restartNumberingAfterBreak="0">
+  <w:abstractNum w:abstractNumId="72" w15:restartNumberingAfterBreak="0">
     <w:nsid w:val="6F4918D4"/>
     <w:multiLevelType w:val="hybridMultilevel"/>
     <w:tmpl w:val="6A3A944A"/>
@@ -29365,7 +30269,7 @@
       </w:rPr>
     </w:lvl>
   </w:abstractNum>
-  <w:abstractNum w:abstractNumId="71" w15:restartNumberingAfterBreak="0">
+  <w:abstractNum w:abstractNumId="73" w15:restartNumberingAfterBreak="0">
     <w:nsid w:val="7094388B"/>
     <w:multiLevelType w:val="hybridMultilevel"/>
     <w:tmpl w:val="F88EFD7C"/>
@@ -29478,7 +30382,93 @@
       </w:rPr>
     </w:lvl>
   </w:abstractNum>
-  <w:abstractNum w:abstractNumId="72" w15:restartNumberingAfterBreak="0">
+  <w:abstractNum w:abstractNumId="74" w15:restartNumberingAfterBreak="0">
+    <w:nsid w:val="721A11FF"/>
+    <w:multiLevelType w:val="hybridMultilevel"/>
+    <w:tmpl w:val="B98CD8DE"/>
+    <w:lvl w:ilvl="0" w:tplc="FFFFFFFF">
+      <w:start w:val="1"/>
+      <w:numFmt w:val="decimal"/>
+      <w:lvlText w:val="%1."/>
+      <w:lvlJc w:val="left"/>
+      <w:pPr>
+        <w:ind w:left="720" w:hanging="360"/>
+      </w:pPr>
+    </w:lvl>
+    <w:lvl w:ilvl="1" w:tplc="40090019" w:tentative="1">
+      <w:start w:val="1"/>
+      <w:numFmt w:val="lowerLetter"/>
+      <w:lvlText w:val="%2."/>
+      <w:lvlJc w:val="left"/>
+      <w:pPr>
+        <w:ind w:left="1440" w:hanging="360"/>
+      </w:pPr>
+    </w:lvl>
+    <w:lvl w:ilvl="2" w:tplc="4009001B" w:tentative="1">
+      <w:start w:val="1"/>
+      <w:numFmt w:val="lowerRoman"/>
+      <w:lvlText w:val="%3."/>
+      <w:lvlJc w:val="right"/>
+      <w:pPr>
+        <w:ind w:left="2160" w:hanging="180"/>
+      </w:pPr>
+    </w:lvl>
+    <w:lvl w:ilvl="3" w:tplc="4009000F" w:tentative="1">
+      <w:start w:val="1"/>
+      <w:numFmt w:val="decimal"/>
+      <w:lvlText w:val="%4."/>
+      <w:lvlJc w:val="left"/>
+      <w:pPr>
+        <w:ind w:left="2880" w:hanging="360"/>
+      </w:pPr>
+    </w:lvl>
+    <w:lvl w:ilvl="4" w:tplc="40090019" w:tentative="1">
+      <w:start w:val="1"/>
+      <w:numFmt w:val="lowerLetter"/>
+      <w:lvlText w:val="%5."/>
+      <w:lvlJc w:val="left"/>
+      <w:pPr>
+        <w:ind w:left="3600" w:hanging="360"/>
+      </w:pPr>
+    </w:lvl>
+    <w:lvl w:ilvl="5" w:tplc="4009001B" w:tentative="1">
+      <w:start w:val="1"/>
+      <w:numFmt w:val="lowerRoman"/>
+      <w:lvlText w:val="%6."/>
+      <w:lvlJc w:val="right"/>
+      <w:pPr>
+        <w:ind w:left="4320" w:hanging="180"/>
+      </w:pPr>
+    </w:lvl>
+    <w:lvl w:ilvl="6" w:tplc="4009000F" w:tentative="1">
+      <w:start w:val="1"/>
+      <w:numFmt w:val="decimal"/>
+      <w:lvlText w:val="%7."/>
+      <w:lvlJc w:val="left"/>
+      <w:pPr>
+        <w:ind w:left="5040" w:hanging="360"/>
+      </w:pPr>
+    </w:lvl>
+    <w:lvl w:ilvl="7" w:tplc="40090019" w:tentative="1">
+      <w:start w:val="1"/>
+      <w:numFmt w:val="lowerLetter"/>
+      <w:lvlText w:val="%8."/>
+      <w:lvlJc w:val="left"/>
+      <w:pPr>
+        <w:ind w:left="5760" w:hanging="360"/>
+      </w:pPr>
+    </w:lvl>
+    <w:lvl w:ilvl="8" w:tplc="4009001B" w:tentative="1">
+      <w:start w:val="1"/>
+      <w:numFmt w:val="lowerRoman"/>
+      <w:lvlText w:val="%9."/>
+      <w:lvlJc w:val="right"/>
+      <w:pPr>
+        <w:ind w:left="6480" w:hanging="180"/>
+      </w:pPr>
+    </w:lvl>
+  </w:abstractNum>
+  <w:abstractNum w:abstractNumId="75" w15:restartNumberingAfterBreak="0">
     <w:nsid w:val="744E3776"/>
     <w:multiLevelType w:val="hybridMultilevel"/>
     <w:tmpl w:val="E6B4052E"/>
@@ -29591,7 +30581,7 @@
       </w:rPr>
     </w:lvl>
   </w:abstractNum>
-  <w:abstractNum w:abstractNumId="73" w15:restartNumberingAfterBreak="0">
+  <w:abstractNum w:abstractNumId="76" w15:restartNumberingAfterBreak="0">
     <w:nsid w:val="75353895"/>
     <w:multiLevelType w:val="hybridMultilevel"/>
     <w:tmpl w:val="B616F9A4"/>
@@ -29704,7 +30694,7 @@
       </w:rPr>
     </w:lvl>
   </w:abstractNum>
-  <w:abstractNum w:abstractNumId="74" w15:restartNumberingAfterBreak="0">
+  <w:abstractNum w:abstractNumId="77" w15:restartNumberingAfterBreak="0">
     <w:nsid w:val="755927F3"/>
     <w:multiLevelType w:val="hybridMultilevel"/>
     <w:tmpl w:val="9704192A"/>
@@ -29817,7 +30807,7 @@
       </w:rPr>
     </w:lvl>
   </w:abstractNum>
-  <w:abstractNum w:abstractNumId="75" w15:restartNumberingAfterBreak="0">
+  <w:abstractNum w:abstractNumId="78" w15:restartNumberingAfterBreak="0">
     <w:nsid w:val="75870C6C"/>
     <w:multiLevelType w:val="multilevel"/>
     <w:tmpl w:val="9EFE1D38"/>
@@ -29966,7 +30956,7 @@
       </w:rPr>
     </w:lvl>
   </w:abstractNum>
-  <w:abstractNum w:abstractNumId="76" w15:restartNumberingAfterBreak="0">
+  <w:abstractNum w:abstractNumId="79" w15:restartNumberingAfterBreak="0">
     <w:nsid w:val="75A03F2C"/>
     <w:multiLevelType w:val="hybridMultilevel"/>
     <w:tmpl w:val="992253C6"/>
@@ -30079,7 +31069,7 @@
       </w:rPr>
     </w:lvl>
   </w:abstractNum>
-  <w:abstractNum w:abstractNumId="77" w15:restartNumberingAfterBreak="0">
+  <w:abstractNum w:abstractNumId="80" w15:restartNumberingAfterBreak="0">
     <w:nsid w:val="767B1730"/>
     <w:multiLevelType w:val="multilevel"/>
     <w:tmpl w:val="82C43D22"/>
@@ -30192,7 +31182,7 @@
       </w:pPr>
     </w:lvl>
   </w:abstractNum>
-  <w:abstractNum w:abstractNumId="78" w15:restartNumberingAfterBreak="0">
+  <w:abstractNum w:abstractNumId="81" w15:restartNumberingAfterBreak="0">
     <w:nsid w:val="771F38A0"/>
     <w:multiLevelType w:val="hybridMultilevel"/>
     <w:tmpl w:val="405C76DA"/>
@@ -30304,7 +31294,7 @@
       </w:rPr>
     </w:lvl>
   </w:abstractNum>
-  <w:abstractNum w:abstractNumId="79" w15:restartNumberingAfterBreak="0">
+  <w:abstractNum w:abstractNumId="82" w15:restartNumberingAfterBreak="0">
     <w:nsid w:val="79A749FF"/>
     <w:multiLevelType w:val="hybridMultilevel"/>
     <w:tmpl w:val="E7FAF078"/>
@@ -30417,7 +31407,7 @@
       </w:rPr>
     </w:lvl>
   </w:abstractNum>
-  <w:abstractNum w:abstractNumId="80" w15:restartNumberingAfterBreak="0">
+  <w:abstractNum w:abstractNumId="83" w15:restartNumberingAfterBreak="0">
     <w:nsid w:val="7AD919A3"/>
     <w:multiLevelType w:val="multilevel"/>
     <w:tmpl w:val="8D0EB290"/>
@@ -30530,7 +31520,7 @@
       </w:pPr>
     </w:lvl>
   </w:abstractNum>
-  <w:abstractNum w:abstractNumId="81" w15:restartNumberingAfterBreak="0">
+  <w:abstractNum w:abstractNumId="84" w15:restartNumberingAfterBreak="0">
     <w:nsid w:val="7BA40304"/>
     <w:multiLevelType w:val="hybridMultilevel"/>
     <w:tmpl w:val="A3EE602C"/>
@@ -30642,7 +31632,7 @@
       </w:rPr>
     </w:lvl>
   </w:abstractNum>
-  <w:abstractNum w:abstractNumId="82" w15:restartNumberingAfterBreak="0">
+  <w:abstractNum w:abstractNumId="85" w15:restartNumberingAfterBreak="0">
     <w:nsid w:val="7BB75F73"/>
     <w:multiLevelType w:val="hybridMultilevel"/>
     <w:tmpl w:val="0FC66770"/>
@@ -30755,7 +31745,7 @@
       </w:rPr>
     </w:lvl>
   </w:abstractNum>
-  <w:abstractNum w:abstractNumId="83" w15:restartNumberingAfterBreak="0">
+  <w:abstractNum w:abstractNumId="86" w15:restartNumberingAfterBreak="0">
     <w:nsid w:val="7D934487"/>
     <w:multiLevelType w:val="hybridMultilevel"/>
     <w:tmpl w:val="474C7D4C"/>
@@ -30868,7 +31858,7 @@
       </w:rPr>
     </w:lvl>
   </w:abstractNum>
-  <w:abstractNum w:abstractNumId="84" w15:restartNumberingAfterBreak="0">
+  <w:abstractNum w:abstractNumId="87" w15:restartNumberingAfterBreak="0">
     <w:nsid w:val="7F425B05"/>
     <w:multiLevelType w:val="hybridMultilevel"/>
     <w:tmpl w:val="259ACE34"/>
@@ -30985,10 +31975,10 @@
     <w:abstractNumId w:val="24"/>
   </w:num>
   <w:num w:numId="2" w16cid:durableId="1168978920">
-    <w:abstractNumId w:val="68"/>
+    <w:abstractNumId w:val="70"/>
   </w:num>
   <w:num w:numId="3" w16cid:durableId="1070419554">
-    <w:abstractNumId w:val="55"/>
+    <w:abstractNumId w:val="56"/>
   </w:num>
   <w:num w:numId="4" w16cid:durableId="2145929862">
     <w:abstractNumId w:val="44"/>
@@ -30997,7 +31987,7 @@
     <w:abstractNumId w:val="16"/>
   </w:num>
   <w:num w:numId="6" w16cid:durableId="1226718342">
-    <w:abstractNumId w:val="59"/>
+    <w:abstractNumId w:val="60"/>
   </w:num>
   <w:num w:numId="7" w16cid:durableId="170949218">
     <w:abstractNumId w:val="48"/>
@@ -31021,37 +32011,37 @@
     <w:abstractNumId w:val="28"/>
   </w:num>
   <w:num w:numId="14" w16cid:durableId="804009462">
-    <w:abstractNumId w:val="54"/>
+    <w:abstractNumId w:val="55"/>
   </w:num>
   <w:num w:numId="15" w16cid:durableId="974136652">
     <w:abstractNumId w:val="12"/>
   </w:num>
   <w:num w:numId="16" w16cid:durableId="180553524">
-    <w:abstractNumId w:val="78"/>
+    <w:abstractNumId w:val="81"/>
   </w:num>
   <w:num w:numId="17" w16cid:durableId="1297485614">
     <w:abstractNumId w:val="11"/>
   </w:num>
   <w:num w:numId="18" w16cid:durableId="951670395">
-    <w:abstractNumId w:val="64"/>
+    <w:abstractNumId w:val="66"/>
   </w:num>
   <w:num w:numId="19" w16cid:durableId="395397196">
-    <w:abstractNumId w:val="61"/>
+    <w:abstractNumId w:val="62"/>
   </w:num>
   <w:num w:numId="20" w16cid:durableId="148332729">
-    <w:abstractNumId w:val="53"/>
+    <w:abstractNumId w:val="54"/>
   </w:num>
   <w:num w:numId="21" w16cid:durableId="1657950533">
-    <w:abstractNumId w:val="77"/>
+    <w:abstractNumId w:val="80"/>
   </w:num>
   <w:num w:numId="22" w16cid:durableId="341901677">
-    <w:abstractNumId w:val="65"/>
+    <w:abstractNumId w:val="67"/>
   </w:num>
   <w:num w:numId="23" w16cid:durableId="764620181">
-    <w:abstractNumId w:val="81"/>
+    <w:abstractNumId w:val="84"/>
   </w:num>
   <w:num w:numId="24" w16cid:durableId="623079547">
-    <w:abstractNumId w:val="57"/>
+    <w:abstractNumId w:val="58"/>
   </w:num>
   <w:num w:numId="25" w16cid:durableId="1502700637">
     <w:abstractNumId w:val="18"/>
@@ -31063,7 +32053,7 @@
     <w:abstractNumId w:val="47"/>
   </w:num>
   <w:num w:numId="28" w16cid:durableId="389966930">
-    <w:abstractNumId w:val="63"/>
+    <w:abstractNumId w:val="65"/>
   </w:num>
   <w:num w:numId="29" w16cid:durableId="787744217">
     <w:abstractNumId w:val="2"/>
@@ -31093,22 +32083,22 @@
     <w:abstractNumId w:val="23"/>
   </w:num>
   <w:num w:numId="38" w16cid:durableId="1474831408">
-    <w:abstractNumId w:val="51"/>
+    <w:abstractNumId w:val="52"/>
   </w:num>
   <w:num w:numId="39" w16cid:durableId="1903714773">
-    <w:abstractNumId w:val="74"/>
+    <w:abstractNumId w:val="77"/>
   </w:num>
   <w:num w:numId="40" w16cid:durableId="15012145">
     <w:abstractNumId w:val="50"/>
   </w:num>
   <w:num w:numId="41" w16cid:durableId="505678018">
-    <w:abstractNumId w:val="75"/>
+    <w:abstractNumId w:val="78"/>
   </w:num>
   <w:num w:numId="42" w16cid:durableId="1119300076">
     <w:abstractNumId w:val="10"/>
   </w:num>
   <w:num w:numId="43" w16cid:durableId="1701589644">
-    <w:abstractNumId w:val="60"/>
+    <w:abstractNumId w:val="61"/>
   </w:num>
   <w:num w:numId="44" w16cid:durableId="722797998">
     <w:abstractNumId w:val="20"/>
@@ -31117,7 +32107,7 @@
     <w:abstractNumId w:val="49"/>
   </w:num>
   <w:num w:numId="46" w16cid:durableId="172111327">
-    <w:abstractNumId w:val="66"/>
+    <w:abstractNumId w:val="68"/>
   </w:num>
   <w:num w:numId="47" w16cid:durableId="1987737814">
     <w:abstractNumId w:val="5"/>
@@ -31129,7 +32119,7 @@
     <w:abstractNumId w:val="22"/>
   </w:num>
   <w:num w:numId="50" w16cid:durableId="1440562836">
-    <w:abstractNumId w:val="80"/>
+    <w:abstractNumId w:val="83"/>
   </w:num>
   <w:num w:numId="51" w16cid:durableId="119111129">
     <w:abstractNumId w:val="42"/>
@@ -31147,31 +32137,31 @@
     <w:abstractNumId w:val="21"/>
   </w:num>
   <w:num w:numId="56" w16cid:durableId="1351298470">
-    <w:abstractNumId w:val="84"/>
+    <w:abstractNumId w:val="87"/>
   </w:num>
   <w:num w:numId="57" w16cid:durableId="595943172">
-    <w:abstractNumId w:val="69"/>
+    <w:abstractNumId w:val="71"/>
   </w:num>
   <w:num w:numId="58" w16cid:durableId="761609018">
-    <w:abstractNumId w:val="71"/>
+    <w:abstractNumId w:val="73"/>
   </w:num>
   <w:num w:numId="59" w16cid:durableId="1020932043">
     <w:abstractNumId w:val="34"/>
   </w:num>
   <w:num w:numId="60" w16cid:durableId="1106191791">
-    <w:abstractNumId w:val="58"/>
+    <w:abstractNumId w:val="59"/>
   </w:num>
   <w:num w:numId="61" w16cid:durableId="1008026605">
-    <w:abstractNumId w:val="62"/>
+    <w:abstractNumId w:val="63"/>
   </w:num>
   <w:num w:numId="62" w16cid:durableId="915745179">
-    <w:abstractNumId w:val="52"/>
+    <w:abstractNumId w:val="53"/>
   </w:num>
   <w:num w:numId="63" w16cid:durableId="1080299330">
     <w:abstractNumId w:val="9"/>
   </w:num>
   <w:num w:numId="64" w16cid:durableId="824052695">
-    <w:abstractNumId w:val="56"/>
+    <w:abstractNumId w:val="57"/>
   </w:num>
   <w:num w:numId="65" w16cid:durableId="1903446732">
     <w:abstractNumId w:val="32"/>
@@ -31186,25 +32176,25 @@
     <w:abstractNumId w:val="43"/>
   </w:num>
   <w:num w:numId="69" w16cid:durableId="2038890968">
-    <w:abstractNumId w:val="67"/>
+    <w:abstractNumId w:val="69"/>
   </w:num>
   <w:num w:numId="70" w16cid:durableId="721826074">
-    <w:abstractNumId w:val="70"/>
+    <w:abstractNumId w:val="72"/>
   </w:num>
   <w:num w:numId="71" w16cid:durableId="1588617072">
     <w:abstractNumId w:val="14"/>
   </w:num>
   <w:num w:numId="72" w16cid:durableId="230428315">
-    <w:abstractNumId w:val="79"/>
+    <w:abstractNumId w:val="82"/>
   </w:num>
   <w:num w:numId="73" w16cid:durableId="1093865920">
     <w:abstractNumId w:val="25"/>
   </w:num>
   <w:num w:numId="74" w16cid:durableId="1775326903">
-    <w:abstractNumId w:val="73"/>
+    <w:abstractNumId w:val="76"/>
   </w:num>
   <w:num w:numId="75" w16cid:durableId="1774549006">
-    <w:abstractNumId w:val="72"/>
+    <w:abstractNumId w:val="75"/>
   </w:num>
   <w:num w:numId="76" w16cid:durableId="715084252">
     <w:abstractNumId w:val="33"/>
@@ -31213,19 +32203,19 @@
     <w:abstractNumId w:val="15"/>
   </w:num>
   <w:num w:numId="78" w16cid:durableId="1881240269">
-    <w:abstractNumId w:val="82"/>
+    <w:abstractNumId w:val="85"/>
   </w:num>
   <w:num w:numId="79" w16cid:durableId="1607930921">
     <w:abstractNumId w:val="7"/>
   </w:num>
   <w:num w:numId="80" w16cid:durableId="1898781353">
-    <w:abstractNumId w:val="76"/>
+    <w:abstractNumId w:val="79"/>
   </w:num>
   <w:num w:numId="81" w16cid:durableId="1541163727">
     <w:abstractNumId w:val="35"/>
   </w:num>
   <w:num w:numId="82" w16cid:durableId="564144523">
-    <w:abstractNumId w:val="83"/>
+    <w:abstractNumId w:val="86"/>
   </w:num>
   <w:num w:numId="83" w16cid:durableId="733043367">
     <w:abstractNumId w:val="4"/>
@@ -31235,6 +32225,15 @@
   </w:num>
   <w:num w:numId="85" w16cid:durableId="1864585992">
     <w:abstractNumId w:val="17"/>
+  </w:num>
+  <w:num w:numId="86" w16cid:durableId="833304582">
+    <w:abstractNumId w:val="64"/>
+  </w:num>
+  <w:num w:numId="87" w16cid:durableId="1346832541">
+    <w:abstractNumId w:val="51"/>
+  </w:num>
+  <w:num w:numId="88" w16cid:durableId="1064336341">
+    <w:abstractNumId w:val="74"/>
   </w:num>
   <w:numIdMacAtCleanup w:val="84"/>
 </w:numbering>
@@ -31879,7 +32878,6 @@
   <w:style w:type="character" w:default="1" w:styleId="DefaultParagraphFont">
     <w:name w:val="Default Paragraph Font"/>
     <w:uiPriority w:val="1"/>
-    <w:semiHidden/>
     <w:unhideWhenUsed/>
   </w:style>
   <w:style w:type="table" w:default="1" w:styleId="TableNormal">

</xml_diff>